<commit_message>
fix(COMM5000): soften log-normal tail wording in M1 report
"match" becomes "are close to" for 6,134 observed vs 6,102 expected
listings above 1,000,000 km; word count 985 in report and guide.

Co-Authored-By: Claude Opus 5.5 <noreply@anthropic.com>
Claude-Session: https://claude.ai/code/session_01KXB524cfiP1RDwAgX9g3vX
</commit_message>
<xml_diff>
--- a/COMM5000/M1_final/01_Report/COMM5000_M1_Report.docx
+++ b/COMM5000/M1_final/01_Report/COMM5000_M1_Report.docx
@@ -46,7 +46,7 @@
           <w:sz w:val="18"/>
           <w:szCs w:val="18"/>
         </w:rPr>
-        <w:t xml:space="preserve">Word count: 983 (excluding tables, figures, captions and references)</w:t>
+        <w:t xml:space="preserve">Word count: 985 (excluding tables, figures, captions and references)</w:t>
       </w:r>
     </w:p>
     <w:p>
@@ -175,7 +175,7 @@
           <w:sz w:val="21"/>
           <w:szCs w:val="21"/>
         </w:rPr>
-        <w:t xml:space="preserve">The guide treats more than 1,000,000 km as implausible (UNSW Business School 2026, p. 7). These 6,134 listings match the 6,102 expected from a log-normal fit, so they may be a genuine tail, but were left out of the usage analysis. A few isolated values, such as 4.6 hp or a price of INR 8,043, are implausible for a car but too few to matter (Table 1).</w:t>
+        <w:t xml:space="preserve">The guide treats more than 1,000,000 km as implausible (UNSW Business School 2026, p. 7). These 6,134 listings are close to the 6,102 expected from a log-normal fit, so they may be a genuine tail, but were left out of the usage analysis. A few isolated values, such as 4.6 hp or a price of INR 8,043, are implausible for a car but too few to matter (Table 1).</w:t>
       </w:r>
     </w:p>
     <w:p>

</xml_diff>

<commit_message>
fix(COMM5000): apply acceptance-matrix cross-check to M1 report
Table 4 screening rule no longer contradicts the hold-out row and states
its limits; Table A5 cited in text; slide 3 citation limited to the
model; dataset citation gets its cell locator; neutral "extreme"
wording for isolated values with a statistical threshold note; unit on
Table A4; fuller word-count line. Acceptance matrix verdicts corrected
and missing items added.

Co-Authored-By: Claude Opus 5.5 <noreply@anthropic.com>
Claude-Session: https://claude.ai/code/session_01KXB524cfiP1RDwAgX9g3vX
</commit_message>
<xml_diff>
--- a/COMM5000/M1_final/01_Report/COMM5000_M1_Report.docx
+++ b/COMM5000/M1_final/01_Report/COMM5000_M1_Report.docx
@@ -46,7 +46,7 @@
           <w:sz w:val="18"/>
           <w:szCs w:val="18"/>
         </w:rPr>
-        <w:t xml:space="preserve">Word count: 978 (excluding tables, figures, captions and references)</w:t>
+        <w:t xml:space="preserve">Word count: 987 (headings included; tables, figures, captions, notes, references and appendix excluded)</w:t>
       </w:r>
     </w:p>
     <w:p>
@@ -145,7 +145,7 @@
           <w:sz w:val="21"/>
           <w:szCs w:val="21"/>
         </w:rPr>
-        <w:t xml:space="preserve">The analysis uses the workbook as randomised on 26 September 2026 (Dataset sheet, cell B6), with every number calculated by Excel formulas. Labels were corrected only where the intended category was obvious, and no listing was deleted (Table 1). ‘Unknown’ entries were kept as a category because they affect 28.2% of rows and cannot be recovered. No cell is blank because the macro fills gaps (Stable Space 2026) and sets negative draws to zero, so technical zeros were treated as missing.</w:t>
+        <w:t xml:space="preserve">The analysis uses the workbook as randomised on 26 September 2026 (Dataset sheet, cell B6), with every number calculated by Excel formulas. Labels were corrected only where the intended category was obvious, and no listing was deleted (Table 1). ‘Unknown’ entries were kept as a category because they affect 28.2% of rows and cannot be recovered. No cell is blank because the macro fills gaps (Stable Space 2026, cell B4) and sets negative draws to zero, so technical zeros were treated as missing.</w:t>
       </w:r>
     </w:p>
     <w:p>
@@ -175,7 +175,7 @@
           <w:sz w:val="21"/>
           <w:szCs w:val="21"/>
         </w:rPr>
-        <w:t xml:space="preserve">The guide treats more than 1,000,000 km as implausible (UNSW Business School 2026, p. 7). These 6,134 listings are close to the 6,102 expected from a log-normal fit, so they may be a genuine tail, but were left out of the usage analysis. A few isolated values, such as 4.6 hp, are implausible but too few to matter (Table 1).</w:t>
+        <w:t xml:space="preserve">The guide treats more than 1,000,000 km as implausible (UNSW Business School 2026, p. 7). These 6,134 listings are close to the 6,102 expected from a log-normal fit, so they may be a genuine tail, but were left out of the usage analysis. A few isolated values, such as 4.6 hp, are extreme but too few to matter (Table 1).</w:t>
       </w:r>
     </w:p>
     <w:p>
@@ -2270,7 +2270,7 @@
           <w:sz w:val="15"/>
           <w:szCs w:val="15"/>
         </w:rPr>
-        <w:t xml:space="preserve">Source: calculated from Stable Space (2026). A group of k identical rows gives k(k − 1)/2 pairs and k − 1 repeat rows. The chance count multiplies, over 13 fields, the probability that two random rows share a category (sum of squared shares); Brand and Year are left out because Model and Registration_Age already fix them.</w:t>
+        <w:t xml:space="preserve">Source: calculated from Stable Space (2026). A group of k identical rows gives k(k − 1)/2 pairs and k − 1 repeat rows. The chance count multiplies, over 13 fields, the probability that two random rows share a category (sum of squared shares); Brand and Year are left out because Model and Registration_Age already fix them. Limits for isolated values are the edges of the dense main range of each frequency distribution.</w:t>
       </w:r>
     </w:p>
     <w:p>
@@ -2303,7 +2303,7 @@
           <w:sz w:val="21"/>
           <w:szCs w:val="21"/>
         </w:rPr>
-        <w:t xml:space="preserve">Table A1 describes all 20 fields. Car_Price is in Indian rupees (INR), and Year and Registration_Age carry the same information. Registration_Age is spread evenly over 1 to 25 years, and Engine_CC, Horsepower and Mileage_kmpl are almost flat across their main range, so their modes in Table 2 are not typical values.</w:t>
+        <w:t xml:space="preserve">Table A1 describes all 20 fields. Car_Price is in Indian rupees (INR), and Year and Registration_Age carry the same information. Registration_Age is spread evenly over 1 to 25 years, and Engine_CC, Horsepower and Mileage_kmpl are roughly flat across their main range, so their modes in Table 2 are not typical values.</w:t>
       </w:r>
     </w:p>
     <w:p>
@@ -9953,7 +9953,7 @@
           <w:sz w:val="21"/>
           <w:szCs w:val="21"/>
         </w:rPr>
-        <w:t xml:space="preserve">Price should be described by its median and modelled on a log scale. Usage has a weak negative association with price, Horsepower and Engine_CC weaker positive ones, and age, brand segment, model and the other fields none of practical size. A luxury premium in cash offers is therefore not supported. Table 4 sets out recommendations for the client, with their evidence and risks.</w:t>
+        <w:t xml:space="preserve">Price should be described by its median and modelled on a log scale. Usage has a weak negative association with price, Horsepower and Engine_CC weaker positive ones, and age, brand segment, model and the other fields none of practical size. A luxury premium in cash offers is therefore not supported. Table 4 sets out recommendations for the client, with their evidence and risks; Table A5 gives the price bands.</w:t>
       </w:r>
     </w:p>
     <w:p>
@@ -10221,7 +10221,7 @@
                 <w:sz w:val="17"/>
                 <w:szCs w:val="17"/>
               </w:rPr>
-              <w:t xml:space="preserve">Skewness 4.9; typical error 55% for the kilometre line (Table 2; Section 3.2)</w:t>
+              <w:t xml:space="preserve">Skewness 4.9; typical error 55% for the kilometre line (Sections 2.3 and 3.2)</w:t>
             </w:r>
           </w:p>
         </w:tc>
@@ -10621,7 +10621,7 @@
                 <w:sz w:val="17"/>
                 <w:szCs w:val="17"/>
               </w:rPr>
-              <w:t xml:space="preserve">Send listings priced outside the 5th to 95th percentile of their usage decile to an appraiser</w:t>
+              <w:t xml:space="preserve">Screen listings priced outside the 5th to 95th percentile of their usage decile for an appraiser</w:t>
             </w:r>
           </w:p>
         </w:tc>
@@ -10656,7 +10656,7 @@
                 <w:sz w:val="17"/>
                 <w:szCs w:val="17"/>
               </w:rPr>
-              <w:t xml:space="preserve">The bands in Table A5 flag 10.0% of listings</w:t>
+              <w:t xml:space="preserve">Band limits fall with usage (P95 INR 3,339,005 in D1, 2,638,995 in D10); by design 10.0% of listings fall outside (Table A5)</w:t>
             </w:r>
           </w:p>
         </w:tc>
@@ -10691,7 +10691,7 @@
                 <w:sz w:val="17"/>
                 <w:szCs w:val="17"/>
               </w:rPr>
-              <w:t xml:space="preserve">Needs appraiser time; bands must be refreshed as prices move</w:t>
+              <w:t xml:space="preserve">Flags unusual prices, not proven mispricing; bands need refreshing as prices move; listings above 1,000,000 km need their own check</w:t>
             </w:r>
           </w:p>
         </w:tc>
@@ -10726,7 +10726,7 @@
                 <w:sz w:val="17"/>
                 <w:szCs w:val="17"/>
               </w:rPr>
-              <w:t xml:space="preserve">Quicker decisions for about 90% of listings; effort goes to unusual prices</w:t>
+              <w:t xml:space="preserve">Appraiser time goes to the 10% most unusual prices; other offers keep the standard process until the hold-out test (last row)</w:t>
             </w:r>
           </w:p>
         </w:tc>
@@ -10981,7 +10981,7 @@
                 <w:sz w:val="17"/>
                 <w:szCs w:val="17"/>
               </w:rPr>
-              <w:t xml:space="preserve">This project may use only the supplied fields (Franch 2026, slide 3); collection has a cost</w:t>
+              <w:t xml:space="preserve">The project model must use only the supplied variables (Franch 2026, slide 3); collection has a cost</w:t>
             </w:r>
           </w:p>
         </w:tc>
@@ -11202,7 +11202,7 @@
           <w:sz w:val="21"/>
           <w:szCs w:val="21"/>
         </w:rPr>
-        <w:t xml:space="preserve">The data are simulated for assessment (UNSW Business School 2026, p. 4), and the macro’s code regenerates Mileage_kmpl, Engine_CC, Horsepower, Kms_Driven and Car_Price without reference to brand or age. This probably explains the missing associations. Each summary also looks at one variable at a time. A straight line of log price on log kilometres (Excel SLOPE and INTERCEPT), fitted and checked on the same listings, misses the listed price by a median of 55.2%, barely better than quoting the overall median (55.3%). On that line, 10% more kilometres means a price about 0.8% lower. A better approach would fit a multiple regression on log price, check it on a hold-out sample and quote a price range. Beyond this project, which may use only the supplied fields (Franch 2026, slide 3), the client could collect condition, trim and final sale price (Table 4).</w:t>
+        <w:t xml:space="preserve">The data are simulated for assessment (UNSW Business School 2026, p. 4), and the macro’s code regenerates Mileage_kmpl, Engine_CC, Horsepower, Kms_Driven and Car_Price without reference to brand or age. This probably explains the missing associations. Each summary also looks at one variable at a time. A straight line of log price on log kilometres (Excel SLOPE and INTERCEPT), fitted and checked on the same listings, misses the listed price by a median of 55.2%, barely better than quoting the overall median (55.3%). On that line, 10% more kilometres means a price about 0.8% lower. A better approach would fit a multiple regression on log price, check it on a hold-out sample and quote a price range. Beyond this project, whose model must use only the supplied variables (Franch 2026, slide 3), the client could collect condition, trim and final sale price (Table 4).</w:t>
       </w:r>
     </w:p>
     <w:p>
@@ -19085,7 +19085,7 @@
                 <w:sz w:val="17"/>
                 <w:szCs w:val="17"/>
               </w:rPr>
-              <w:t xml:space="preserve">Median price</w:t>
+              <w:t xml:space="preserve">Median price (INR)</w:t>
             </w:r>
           </w:p>
         </w:tc>
@@ -24138,7 +24138,7 @@
           <w:sz w:val="15"/>
           <w:szCs w:val="15"/>
         </w:rPr>
-        <w:t xml:space="preserve">Source: calculated from Stable Space (2026). Listings below P5 or above P95 of their own decile make up 10.0% of the total (manual-check rule in Table 4).</w:t>
+        <w:t xml:space="preserve">Source: calculated from Stable Space (2026). Listings below P5 or above P95 of their own decile make up 10.0% of the 998,866 listings in this table (screening rule in Table 4).</w:t>
       </w:r>
     </w:p>
     <w:sectPr>

</xml_diff>